<commit_message>
Corrected my new job title.
</commit_message>
<xml_diff>
--- a/resumes/ryanparman-cloud-platform-devops-sre-infra-workday.docx
+++ b/resumes/ryanparman-cloud-platform-devops-sre-infra-workday.docx
@@ -85,13 +85,13 @@
         <w:t xml:space="preserve">Work Experience</w:t>
       </w:r>
     </w:p>
-    <w:bookmarkStart w:id="14" w:name="cloud-architect"/>
+    <w:bookmarkStart w:id="14" w:name="cloud-solutions-architect"/>
     <w:p>
       <w:pPr>
         <w:pStyle w:val="Heading3"/>
       </w:pPr>
       <w:r>
-        <w:t xml:space="preserve">Cloud Architect</w:t>
+        <w:t xml:space="preserve">Cloud Solutions Architect</w:t>
       </w:r>
     </w:p>
     <w:p>
@@ -99,7 +99,7 @@
         <w:pStyle w:val="FirstParagraph"/>
       </w:pPr>
       <w:r>
-        <w:t xml:space="preserve">Job Title: Cloud Architect</w:t>
+        <w:t xml:space="preserve">Job Title: Cloud Solutions Architect</w:t>
       </w:r>
       <w:r>
         <w:br/>

</xml_diff>

<commit_message>
refactor: Update resume structure and consolidate WePay role.
* Added detailed accomplishments for Rackspace Cloud Solutions Architect role.
* Consolidated WePay roles to older roles section with simplified formatting.
* Moved full WePay role details to the previously.md supplementary document.
* Removed date ranges from older roles in main resume for cleaner presentation.
* Configured VSCode editor associations for git files, notebooks, and data.
* Regenerated resume documents (PDF/DOCX) from updated markdown and templates.
</commit_message>
<xml_diff>
--- a/resumes/ryanparman-cloud-platform-devops-sre-infra-workday.docx
+++ b/resumes/ryanparman-cloud-platform-devops-sre-infra-workday.docx
@@ -2,7 +2,7 @@
 <file path=word/document.xml><?xml version="1.0" encoding="utf-8"?>
 <w:document xmlns:w="http://schemas.openxmlformats.org/wordprocessingml/2006/main" xmlns:m="http://schemas.openxmlformats.org/officeDocument/2006/math" xmlns:r="http://schemas.openxmlformats.org/officeDocument/2006/relationships" xmlns:o="urn:schemas-microsoft-com:office:office" xmlns:v="urn:schemas-microsoft-com:vml" xmlns:w10="urn:schemas-microsoft-com:office:word" xmlns:a="http://schemas.openxmlformats.org/drawingml/2006/main" xmlns:pic="http://schemas.openxmlformats.org/drawingml/2006/picture" xmlns:wp="http://schemas.openxmlformats.org/drawingml/2006/wordprocessingDrawing">
   <w:body>
-    <w:bookmarkStart w:id="25" w:name="ryan-parman"/>
+    <w:bookmarkStart w:id="23" w:name="ryan-parman"/>
     <w:p>
       <w:pPr>
         <w:pStyle w:val="Heading1"/>
@@ -76,7 +76,7 @@
         </w:r>
       </w:hyperlink>
     </w:p>
-    <w:bookmarkStart w:id="22" w:name="work-experience"/>
+    <w:bookmarkStart w:id="20" w:name="work-experience"/>
     <w:p>
       <w:pPr>
         <w:pStyle w:val="Heading2"/>
@@ -135,7 +135,31 @@
         </w:numPr>
       </w:pPr>
       <w:r>
-        <w:t xml:space="preserve">TBD</w:t>
+        <w:t xml:space="preserve">Worked with a variety of clients in different industries.</w:t>
+      </w:r>
+    </w:p>
+    <w:p>
+      <w:pPr>
+        <w:pStyle w:val="Compact"/>
+        <w:numPr>
+          <w:ilvl w:val="0"/>
+          <w:numId w:val="1001"/>
+        </w:numPr>
+      </w:pPr>
+      <w:r>
+        <w:t xml:space="preserve">Invested in approaches to get agentic development agents to provide high-quality results (e.g., spec-driven development, steering files, determinate validation of agentic results, custom MCP servers, token management).</w:t>
+      </w:r>
+    </w:p>
+    <w:p>
+      <w:pPr>
+        <w:pStyle w:val="Compact"/>
+        <w:numPr>
+          <w:ilvl w:val="0"/>
+          <w:numId w:val="1001"/>
+        </w:numPr>
+      </w:pPr>
+      <w:r>
+        <w:t xml:space="preserve">Terraform, AWS, and Go development (odds and ends).</w:t>
       </w:r>
     </w:p>
     <w:bookmarkEnd w:id="14"/>
@@ -733,13 +757,14 @@
       </w:r>
     </w:p>
     <w:bookmarkEnd w:id="19"/>
-    <w:bookmarkStart w:id="20" w:name="senior-devops-engineer"/>
-    <w:p>
-      <w:pPr>
-        <w:pStyle w:val="Heading3"/>
-      </w:pPr>
-      <w:r>
-        <w:t xml:space="preserve">Senior DevOps Engineer</w:t>
+    <w:bookmarkEnd w:id="20"/>
+    <w:bookmarkStart w:id="21" w:name="skills"/>
+    <w:p>
+      <w:pPr>
+        <w:pStyle w:val="Heading2"/>
+      </w:pPr>
+      <w:r>
+        <w:t xml:space="preserve">Skills</w:t>
       </w:r>
     </w:p>
     <w:p>
@@ -747,89 +772,25 @@
         <w:pStyle w:val="FirstParagraph"/>
       </w:pPr>
       <w:r>
-        <w:t xml:space="preserve">Job Title: Senior DevOps Engineer</w:t>
-      </w:r>
-      <w:r>
-        <w:br/>
-      </w:r>
-      <w:r>
-        <w:t xml:space="preserve">Company: WePay</w:t>
-      </w:r>
-      <w:r>
-        <w:br/>
-      </w:r>
-      <w:r>
-        <w:t xml:space="preserve">Location: Redwood City, CA</w:t>
-      </w:r>
-      <w:r>
-        <w:br/>
-      </w:r>
-      <w:r>
-        <w:t xml:space="preserve">From: 04/2015</w:t>
-      </w:r>
-      <w:r>
-        <w:br/>
-      </w:r>
-      <w:r>
-        <w:t xml:space="preserve">To: 09/2016</w:t>
-      </w:r>
-    </w:p>
-    <w:p>
-      <w:pPr>
-        <w:pStyle w:val="Compact"/>
-        <w:numPr>
-          <w:ilvl w:val="0"/>
-          <w:numId w:val="1007"/>
-        </w:numPr>
-      </w:pPr>
-      <w:r>
-        <w:t xml:space="preserve">Led a cross-company initiative to upgrade the monolithic application from PHP 5.4 to PHP 5.6 (the latest at the time). Facilitated cross-team collaboration among all major engineering teams and QA departments to achieve results (PHP, project management).</w:t>
-      </w:r>
-    </w:p>
-    <w:p>
-      <w:pPr>
-        <w:pStyle w:val="Compact"/>
-        <w:numPr>
-          <w:ilvl w:val="0"/>
-          <w:numId w:val="1007"/>
-        </w:numPr>
-      </w:pPr>
-      <w:r>
-        <w:t xml:space="preserve">Initiated a program to automate the creation of base server images for cloud servers. This allowed new servers to boot and begin serving traffic ~75% faster (GCP, Python, Ansible).</w:t>
-      </w:r>
-    </w:p>
-    <w:p>
-      <w:pPr>
-        <w:pStyle w:val="Compact"/>
-        <w:numPr>
-          <w:ilvl w:val="0"/>
-          <w:numId w:val="1007"/>
-        </w:numPr>
-      </w:pPr>
-      <w:r>
-        <w:t xml:space="preserve">Invested in observability systems to prevent customer-facing issues (New Relic, Grafana).</w:t>
-      </w:r>
-    </w:p>
-    <w:p>
-      <w:pPr>
-        <w:pStyle w:val="Compact"/>
-        <w:numPr>
-          <w:ilvl w:val="0"/>
-          <w:numId w:val="1007"/>
-        </w:numPr>
-      </w:pPr>
-      <w:r>
-        <w:t xml:space="preserve">Explored configuration-as-code for cloud infrastructure in Google Cloud to improve reliability and efficiency (Python, Terraform).</w:t>
-      </w:r>
-    </w:p>
-    <w:bookmarkEnd w:id="20"/>
-    <w:bookmarkStart w:id="21" w:name="senior-api-engineer"/>
-    <w:p>
-      <w:pPr>
-        <w:pStyle w:val="Heading3"/>
-      </w:pPr>
-      <w:r>
-        <w:t xml:space="preserve">Senior API Engineer</w:t>
+        <w:t xml:space="preserve">This list is not exhaustive, but these are software and hard skills I leveraged in the roles above which are most relevant to Cloud Engineering, DevOps, and Site Reliability Engineering roles.</w:t>
+      </w:r>
+    </w:p>
+    <w:p>
+      <w:pPr>
+        <w:pStyle w:val="BodyText"/>
+      </w:pPr>
+      <w:r>
+        <w:t xml:space="preserve">CI/CD, Cloud Engineering, DevOps, DevSecOps, Platform Engineering, Site Reliability Engineering, ARM64, AWS Well-Architected, Amazon Linux, Amazon Web Services, Ansible, Artifactory, Bash, CIS, CentOS, CircleCI, CloudFormation, CloudWatch, Control Tower, Datadog, Docker, ECS, GitHub Actions, GitHub Enterprise, GitOps, Git, Go, JavaScript, Lambda, New Relic, Nginx, OpenTelemetry, OpenTofu, PHP, Packer, Python, Redis, SDKs, Terraform, Traefik, Ubuntu, cloud-init, architecture, automation, disaster recovery, distributed systems, encryption at rest, error budget, fault tolerance, multi-platform, performance, reliability, scalability, scripting, security, troubleshooting, uptime.</w:t>
+      </w:r>
+    </w:p>
+    <w:bookmarkEnd w:id="21"/>
+    <w:bookmarkStart w:id="22" w:name="education"/>
+    <w:p>
+      <w:pPr>
+        <w:pStyle w:val="Heading2"/>
+      </w:pPr>
+      <w:r>
+        <w:t xml:space="preserve">Education</w:t>
       </w:r>
     </w:p>
     <w:p>
@@ -837,116 +798,11 @@
         <w:pStyle w:val="FirstParagraph"/>
       </w:pPr>
       <w:r>
-        <w:t xml:space="preserve">Job Title: Senior API Engineer</w:t>
-      </w:r>
-      <w:r>
-        <w:br/>
-      </w:r>
-      <w:r>
-        <w:t xml:space="preserve">Company: WePay</w:t>
-      </w:r>
-      <w:r>
-        <w:br/>
-      </w:r>
-      <w:r>
-        <w:t xml:space="preserve">Location: Palo Alto, CA</w:t>
-      </w:r>
-      <w:r>
-        <w:br/>
-      </w:r>
-      <w:r>
-        <w:t xml:space="preserve">From: 04/2014</w:t>
-      </w:r>
-      <w:r>
-        <w:br/>
-      </w:r>
-      <w:r>
-        <w:t xml:space="preserve">To: 04/2015</w:t>
-      </w:r>
-    </w:p>
-    <w:p>
-      <w:pPr>
-        <w:pStyle w:val="Compact"/>
-        <w:numPr>
-          <w:ilvl w:val="0"/>
-          <w:numId w:val="1008"/>
-        </w:numPr>
-      </w:pPr>
-      <w:r>
-        <w:t xml:space="preserve">Led the company's HackerOne security program, coordinating across teams to address security issues.</w:t>
-      </w:r>
-    </w:p>
-    <w:p>
-      <w:pPr>
-        <w:pStyle w:val="Compact"/>
-        <w:numPr>
-          <w:ilvl w:val="0"/>
-          <w:numId w:val="1008"/>
-        </w:numPr>
-      </w:pPr>
-      <w:r>
-        <w:t xml:space="preserve">Brought performance improvements, new features, improved testing processes, and new QA tooling to WePay (PHP, BDD, TDD).</w:t>
-      </w:r>
-    </w:p>
-    <w:p>
-      <w:pPr>
-        <w:pStyle w:val="Compact"/>
-        <w:numPr>
-          <w:ilvl w:val="0"/>
-          <w:numId w:val="1008"/>
-        </w:numPr>
-      </w:pPr>
-      <w:r>
-        <w:t xml:space="preserve">Built a local development environment for engineering teams using Vagrant and VMWare Fusion. Eliminated works on my machine, and reduced new engineer onboarding time from 2 weeks to 1 day (measured by when a new employee could make their first commit).</w:t>
-      </w:r>
-    </w:p>
-    <w:bookmarkEnd w:id="21"/>
+        <w:t xml:space="preserve">Silicon Valley College (now Carrington College), San Jose, CA. Bachelor of Arts, Design and Visualization</w:t>
+      </w:r>
+    </w:p>
     <w:bookmarkEnd w:id="22"/>
-    <w:bookmarkStart w:id="23" w:name="skills"/>
-    <w:p>
-      <w:pPr>
-        <w:pStyle w:val="Heading2"/>
-      </w:pPr>
-      <w:r>
-        <w:t xml:space="preserve">Skills</w:t>
-      </w:r>
-    </w:p>
-    <w:p>
-      <w:pPr>
-        <w:pStyle w:val="FirstParagraph"/>
-      </w:pPr>
-      <w:r>
-        <w:t xml:space="preserve">This list is not exhaustive, but these are software and hard skills I leveraged in the roles above which are most relevant to Cloud Engineering, DevOps, and Site Reliability Engineering roles.</w:t>
-      </w:r>
-    </w:p>
-    <w:p>
-      <w:pPr>
-        <w:pStyle w:val="BodyText"/>
-      </w:pPr>
-      <w:r>
-        <w:t xml:space="preserve">CI/CD, Cloud Engineering, DevOps, DevSecOps, Platform Engineering, Site Reliability Engineering, ARM64, AWS Well-Architected, Amazon Linux, Amazon Web Services, Ansible, Artifactory, Bash, CIS, CentOS, CircleCI, CloudFormation, CloudWatch, Control Tower, Datadog, Docker, ECS, GitHub Actions, GitHub Enterprise, GitOps, Git, Go, JavaScript, Lambda, New Relic, Nginx, OpenTelemetry, OpenTofu, PHP, Packer, Python, Redis, SDKs, Terraform, Traefik, Ubuntu, cloud-init, architecture, automation, disaster recovery, distributed systems, encryption at rest, error budget, fault tolerance, multi-platform, performance, reliability, scalability, scripting, security, troubleshooting, uptime.</w:t>
-      </w:r>
-    </w:p>
     <w:bookmarkEnd w:id="23"/>
-    <w:bookmarkStart w:id="24" w:name="education"/>
-    <w:p>
-      <w:pPr>
-        <w:pStyle w:val="Heading2"/>
-      </w:pPr>
-      <w:r>
-        <w:t xml:space="preserve">Education</w:t>
-      </w:r>
-    </w:p>
-    <w:p>
-      <w:pPr>
-        <w:pStyle w:val="FirstParagraph"/>
-      </w:pPr>
-      <w:r>
-        <w:t xml:space="preserve">Silicon Valley College (now Carrington College), San Jose, CA. Bachelor of Arts, Design and Visualization</w:t>
-      </w:r>
-    </w:p>
-    <w:bookmarkEnd w:id="24"/>
-    <w:bookmarkEnd w:id="25"/>
     <w:sectPr>
       <w:pgSz w:h="15840" w:w="12240"/>
       <w:pgMar w:bottom="1440" w:footer="720" w:gutter="0" w:header="720" w:left="1440" w:right="1440" w:top="1440"/>
@@ -1396,12 +1252,6 @@
     <w:abstractNumId w:val="991"/>
   </w:num>
   <w:num w:numId="1006">
-    <w:abstractNumId w:val="991"/>
-  </w:num>
-  <w:num w:numId="1007">
-    <w:abstractNumId w:val="991"/>
-  </w:num>
-  <w:num w:numId="1008">
     <w:abstractNumId w:val="991"/>
   </w:num>
 </w:numbering>

</xml_diff>